<commit_message>
Add Etap C project notes
</commit_message>
<xml_diff>
--- a/project/etap-C/sciaga-merytoryczna.docx
+++ b/project/etap-C/sciaga-merytoryczna.docx
@@ -98,6 +98,101 @@
           <w:lang w:val="pl-PL"/>
         </w:rPr>
         <w:t xml:space="preserve">Elementy: aktorzy, cele i sekwencje działań prowadzące do realizacji tych celów. </w:t>
+      </w:r>
+    </w:p>
+    <w:p>
+      <w:pPr>
+        <w:spacing w:line="240" w:lineRule="auto"/>
+        <w:rPr>
+          <w:i/>
+          <w:iCs/>
+          <w:lang w:val="pl-PL"/>
+        </w:rPr>
+      </w:pPr>
+    </w:p>
+    <w:p>
+      <w:pPr>
+        <w:pStyle w:val="Heading1"/>
+        <w:rPr>
+          <w:lang w:val="pl-PL"/>
+        </w:rPr>
+      </w:pPr>
+      <w:r>
+        <w:rPr>
+          <w:lang w:val="pl-PL"/>
+        </w:rPr>
+        <w:t>Proces biznesowy</w:t>
+      </w:r>
+    </w:p>
+    <w:p>
+      <w:pPr>
+        <w:rPr>
+          <w:lang w:val="pl-PL"/>
+        </w:rPr>
+      </w:pPr>
+      <w:r>
+        <w:rPr>
+          <w:lang w:val="pl-PL"/>
+        </w:rPr>
+        <w:t xml:space="preserve">Proces = sekwencja działań zmierzająca do celu biznesowego. </w:t>
+      </w:r>
+    </w:p>
+    <w:p>
+      <w:pPr>
+        <w:rPr>
+          <w:lang w:val="pl-PL"/>
+        </w:rPr>
+      </w:pPr>
+      <w:r>
+        <w:rPr>
+          <w:lang w:val="pl-PL"/>
+        </w:rPr>
+        <w:t xml:space="preserve">Przypadek użycia = konkretna interakcja aktora z systemem realizująca fragment tego procesu. </w:t>
+      </w:r>
+    </w:p>
+    <w:p>
+      <w:pPr>
+        <w:rPr>
+          <w:lang w:val="pl-PL"/>
+        </w:rPr>
+      </w:pPr>
+      <w:r>
+        <w:rPr>
+          <w:lang w:val="pl-PL"/>
+        </w:rPr>
+        <w:t>H</w:t>
+      </w:r>
+      <w:r>
+        <w:rPr>
+          <w:lang w:val="pl-PL"/>
+        </w:rPr>
+        <w:t>ierarchia: Proces → UC</w:t>
+      </w:r>
+      <w:r>
+        <w:rPr>
+          <w:lang w:val="pl-PL"/>
+        </w:rPr>
+        <w:t xml:space="preserve"> (</w:t>
+      </w:r>
+      <w:proofErr w:type="spellStart"/>
+      <w:r>
+        <w:rPr>
+          <w:lang w:val="pl-PL"/>
+        </w:rPr>
+        <w:t>Use</w:t>
+      </w:r>
+      <w:proofErr w:type="spellEnd"/>
+      <w:r>
+        <w:rPr>
+          <w:lang w:val="pl-PL"/>
+        </w:rPr>
+        <w:t xml:space="preserve"> Case)</w:t>
+      </w:r>
+      <w:r>
+        <w:rPr>
+          <w:lang w:val="pl-PL"/>
+        </w:rPr>
+        <w:t xml:space="preserve"> → Wymagania.</w:t>
       </w:r>
     </w:p>
     <w:p>
@@ -368,6 +463,7 @@
         <w:rPr>
           <w:lang w:val="pl-PL"/>
         </w:rPr>
+        <w:lastRenderedPageBreak/>
         <w:t xml:space="preserve">Scenariusze przypadków użycia </w:t>
       </w:r>
     </w:p>

</xml_diff>